<commit_message>
docs(implementation): add the follow-up variables and the to-close smoke test to the Spanish implementation procedure
</commit_message>
<xml_diff>
--- a/07_PROCEDIMIENTO_DE_IMPLEMENTACION/ES/WORD/07_Procedimiento_De_Implementacion.docx
+++ b/07_PROCEDIMIENTO_DE_IMPLEMENTACION/ES/WORD/07_Procedimiento_De_Implementacion.docx
@@ -64,7 +64,7 @@
         <w:pStyle w:val="BodyText"/>
       </w:pPr>
       <w:r>
-        <w:t xml:space="preserve">20 de octubre de 2026</w:t>
+        <w:t xml:space="preserve">21 de octubre de 2026</w:t>
       </w:r>
     </w:p>
     <w:p>
@@ -72,7 +72,7 @@
         <w:pStyle w:val="BodyText"/>
       </w:pPr>
       <w:r>
-        <w:t xml:space="preserve">Tipo de documento: Procedimiento de implementación (equipo de desarrollo, administrador de TI y responsable del negocio) · Versión 2.3</w:t>
+        <w:t xml:space="preserve">Tipo de documento: Procedimiento de implementación (equipo de desarrollo, administrador de TI y responsable del negocio) · Versión 2.5</w:t>
       </w:r>
     </w:p>
     <w:bookmarkStart w:id="20" w:name="control-de-versiones"/>
@@ -439,6 +439,114 @@
           </w:p>
         </w:tc>
       </w:tr>
+      <w:tr>
+        <w:tc>
+          <w:tcPr/>
+          <w:p>
+            <w:pPr>
+              <w:pStyle w:val="Compact"/>
+            </w:pPr>
+            <w:r>
+              <w:t xml:space="preserve">2.4</w:t>
+            </w:r>
+          </w:p>
+        </w:tc>
+        <w:tc>
+          <w:tcPr/>
+          <w:p>
+            <w:pPr>
+              <w:pStyle w:val="Compact"/>
+            </w:pPr>
+            <w:r>
+              <w:t xml:space="preserve">2026-10-21</w:t>
+            </w:r>
+          </w:p>
+        </w:tc>
+        <w:tc>
+          <w:tcPr/>
+          <w:p>
+            <w:pPr>
+              <w:pStyle w:val="Compact"/>
+            </w:pPr>
+            <w:r>
+              <w:t xml:space="preserve">Revisión contra el código y el servidor del 21 de octubre de 2026: criterio E2 con las pruebas de ese día (689 automatizadas y 19 de punta a punta), respaldo previo automático en el servidor público (fase 3, monitoreo y reversión), prueba de humo H10 (el token de una sesión cerrada deja de servir), variables nuevas con valor por defecto, actualizaciones de la app sin APK nuevo y riesgo R-I11.</w:t>
+            </w:r>
+          </w:p>
+        </w:tc>
+        <w:tc>
+          <w:tcPr/>
+          <w:p>
+            <w:pPr>
+              <w:pStyle w:val="Compact"/>
+            </w:pPr>
+            <w:r>
+              <w:t xml:space="preserve">Equipo de desarrollo</w:t>
+            </w:r>
+          </w:p>
+        </w:tc>
+      </w:tr>
+      <w:tr>
+        <w:tc>
+          <w:tcPr/>
+          <w:p>
+            <w:pPr>
+              <w:pStyle w:val="Compact"/>
+            </w:pPr>
+            <w:r>
+              <w:t xml:space="preserve">2.5</w:t>
+            </w:r>
+          </w:p>
+        </w:tc>
+        <w:tc>
+          <w:tcPr/>
+          <w:p>
+            <w:pPr>
+              <w:pStyle w:val="Compact"/>
+            </w:pPr>
+            <w:r>
+              <w:t xml:space="preserve">2026-10-21</w:t>
+            </w:r>
+          </w:p>
+        </w:tc>
+        <w:tc>
+          <w:tcPr/>
+          <w:p>
+            <w:pPr>
+              <w:pStyle w:val="Compact"/>
+            </w:pPr>
+            <w:r>
+              <w:t xml:space="preserve">Revisión contra el código de la noche del 21 de octubre de 2026: criterio E2 con la ejecución final de ese día (707 pruebas automatizadas y 19 de punta a punta), variables</w:t>
+            </w:r>
+            <w:r>
+              <w:t xml:space="preserve"> </w:t>
+            </w:r>
+            <w:r>
+              <w:rPr>
+                <w:i/>
+                <w:iCs/>
+              </w:rPr>
+              <w:t xml:space="preserve">FOLLOW_UP_*</w:t>
+            </w:r>
+            <w:r>
+              <w:t xml:space="preserve"> </w:t>
+            </w:r>
+            <w:r>
+              <w:t xml:space="preserve">de operations-service, prueba de humo H11 (lista "Por cerrar" del administrador) y regla de configuración actualizada. Las reservas confirmadas con operario que nadie registró ya no se cierran solas como "No asistió": las resuelve el administrador.</w:t>
+            </w:r>
+          </w:p>
+        </w:tc>
+        <w:tc>
+          <w:tcPr/>
+          <w:p>
+            <w:pPr>
+              <w:pStyle w:val="Compact"/>
+            </w:pPr>
+            <w:r>
+              <w:t xml:space="preserve">Equipo de desarrollo</w:t>
+            </w:r>
+          </w:p>
+        </w:tc>
+      </w:tr>
     </w:tbl>
     <w:p>
       <w:pPr>
@@ -1367,7 +1475,7 @@
         <w:t xml:space="preserve"> </w:t>
       </w:r>
       <w:r>
-        <w:t xml:space="preserve">al 17 de octubre de 2026), en especial</w:t>
+        <w:t xml:space="preserve">al 21 de octubre de 2026), en especial</w:t>
       </w:r>
       <w:r>
         <w:t xml:space="preserve"> </w:t>
@@ -4614,7 +4722,7 @@
               <w:pStyle w:val="Compact"/>
             </w:pPr>
             <w:r>
-              <w:t xml:space="preserve">Resúmenes sin fallos (el 19 de octubre de 2026: 655 pruebas automatizadas y 19 de punta a punta).</w:t>
+              <w:t xml:space="preserve">Resúmenes sin fallos (ejecución final del 21 de octubre de 2026: 707 pruebas automatizadas y 19 de punta a punta).</w:t>
             </w:r>
           </w:p>
         </w:tc>
@@ -4976,7 +5084,52 @@
               <w:t xml:space="preserve"> </w:t>
             </w:r>
             <w:r>
-              <w:t xml:space="preserve">y salida de RESTORE VERIFYONLY.</w:t>
+              <w:t xml:space="preserve">y salida de RESTORE VERIFYONLY; en el servidor público, las líneas</w:t>
+            </w:r>
+            <w:r>
+              <w:t xml:space="preserve"> </w:t>
+            </w:r>
+            <w:r>
+              <w:rPr>
+                <w:i/>
+                <w:iCs/>
+              </w:rPr>
+              <w:t xml:space="preserve">RESPALDO | OK</w:t>
+            </w:r>
+            <w:r>
+              <w:t xml:space="preserve"> </w:t>
+            </w:r>
+            <w:r>
+              <w:t xml:space="preserve">y</w:t>
+            </w:r>
+            <w:r>
+              <w:t xml:space="preserve"> </w:t>
+            </w:r>
+            <w:r>
+              <w:rPr>
+                <w:i/>
+                <w:iCs/>
+              </w:rPr>
+              <w:t xml:space="preserve">VERIFICACIÓN | OK</w:t>
+            </w:r>
+            <w:r>
+              <w:t xml:space="preserve"> </w:t>
+            </w:r>
+            <w:r>
+              <w:t xml:space="preserve">de</w:t>
+            </w:r>
+            <w:r>
+              <w:t xml:space="preserve"> </w:t>
+            </w:r>
+            <w:r>
+              <w:rPr>
+                <w:i/>
+                <w:iCs/>
+              </w:rPr>
+              <w:t xml:space="preserve">~/lavarapido/backups/backup.log</w:t>
+            </w:r>
+            <w:r>
+              <w:t xml:space="preserve">.</w:t>
             </w:r>
           </w:p>
         </w:tc>
@@ -6388,6 +6541,54 @@
           </w:p>
         </w:tc>
       </w:tr>
+      <w:tr>
+        <w:tc>
+          <w:tcPr/>
+          <w:p>
+            <w:pPr>
+              <w:pStyle w:val="Compact"/>
+            </w:pPr>
+            <w:r>
+              <w:t xml:space="preserve">SESSION_CHECK_*, BOOKING_EXPIRY_*, FOLLOW_UP_*</w:t>
+            </w:r>
+          </w:p>
+        </w:tc>
+        <w:tc>
+          <w:tcPr/>
+          <w:p>
+            <w:pPr>
+              <w:pStyle w:val="Compact"/>
+            </w:pPr>
+            <w:r>
+              <w:t xml:space="preserve">No se definen.</w:t>
+            </w:r>
+          </w:p>
+        </w:tc>
+        <w:tc>
+          <w:tcPr/>
+          <w:p>
+            <w:pPr>
+              <w:pStyle w:val="Compact"/>
+            </w:pPr>
+            <w:r>
+              <w:t xml:space="preserve">Tienen valor por defecto (chequeo de sesión del gateway activo con 30 s y 3 s; cancelación de las reservas programadas que vencieron sin confirmarse cada 5 minutos, con 60 minutos de margen después del fin; seguimiento de operations-service cada 5 minutos para las reservas que terminaron y nadie cerró, que usa el mismo margen y</w:t>
+            </w:r>
+            <w:r>
+              <w:t xml:space="preserve"> </w:t>
+            </w:r>
+            <w:r>
+              <w:rPr>
+                <w:i/>
+                <w:iCs/>
+              </w:rPr>
+              <w:t xml:space="preserve">INTERNAL_API_KEY</w:t>
+            </w:r>
+            <w:r>
+              <w:t xml:space="preserve">) y el archivo de Compose no las pasa a los contenedores.</w:t>
+            </w:r>
+          </w:p>
+        </w:tc>
+      </w:tr>
     </w:tbl>
     <w:p>
       <w:pPr>
@@ -6873,6 +7074,75 @@
     </w:p>
     <w:p>
       <w:pPr>
+        <w:pStyle w:val="BodyText"/>
+      </w:pPr>
+      <w:r>
+        <w:t xml:space="preserve">En el servidor público esta fase es automática:</w:t>
+      </w:r>
+      <w:r>
+        <w:t xml:space="preserve"> </w:t>
+      </w:r>
+      <w:r>
+        <w:rPr>
+          <w:i/>
+          <w:iCs/>
+        </w:rPr>
+        <w:t xml:space="preserve">deploy/update-server.sh</w:t>
+      </w:r>
+      <w:r>
+        <w:t xml:space="preserve"> </w:t>
+      </w:r>
+      <w:r>
+        <w:t xml:space="preserve">corre primero</w:t>
+      </w:r>
+      <w:r>
+        <w:t xml:space="preserve"> </w:t>
+      </w:r>
+      <w:r>
+        <w:rPr>
+          <w:i/>
+          <w:iCs/>
+        </w:rPr>
+        <w:t xml:space="preserve">deploy/backup-db.sh</w:t>
+      </w:r>
+      <w:r>
+        <w:t xml:space="preserve"> </w:t>
+      </w:r>
+      <w:r>
+        <w:t xml:space="preserve">(respaldo completo con suma de comprobación,</w:t>
+      </w:r>
+      <w:r>
+        <w:t xml:space="preserve"> </w:t>
+      </w:r>
+      <w:r>
+        <w:rPr>
+          <w:i/>
+          <w:iCs/>
+        </w:rPr>
+        <w:t xml:space="preserve">RESTORE VERIFYONLY</w:t>
+      </w:r>
+      <w:r>
+        <w:t xml:space="preserve"> </w:t>
+      </w:r>
+      <w:r>
+        <w:t xml:space="preserve">y copia comprimida en</w:t>
+      </w:r>
+      <w:r>
+        <w:t xml:space="preserve"> </w:t>
+      </w:r>
+      <w:r>
+        <w:rPr>
+          <w:i/>
+          <w:iCs/>
+        </w:rPr>
+        <w:t xml:space="preserve">~/lavarapido/backups/</w:t>
+      </w:r>
+      <w:r>
+        <w:t xml:space="preserve">, donde se guardan los últimos 14) y, si el respaldo falla, no actualiza (Documento de Despliegue, sección 3.2). Los pasos siguientes son para un equipo de la red local.</w:t>
+      </w:r>
+    </w:p>
+    <w:p>
+      <w:pPr>
         <w:pStyle w:val="Compact"/>
         <w:numPr>
           <w:ilvl w:val="0"/>
@@ -7195,7 +7465,36 @@
         <w:t xml:space="preserve"> </w:t>
       </w:r>
       <w:r>
-        <w:t xml:space="preserve">nombre, tamaño y resultado de la verificación del respaldo.</w:t>
+        <w:t xml:space="preserve">nombre, tamaño y resultado de la verificación del respaldo (en el servidor público, la línea</w:t>
+      </w:r>
+      <w:r>
+        <w:t xml:space="preserve"> </w:t>
+      </w:r>
+      <w:r>
+        <w:rPr>
+          <w:i/>
+          <w:iCs/>
+        </w:rPr>
+        <w:t xml:space="preserve">RESPALDO | OK</w:t>
+      </w:r>
+      <w:r>
+        <w:t xml:space="preserve"> </w:t>
+      </w:r>
+      <w:r>
+        <w:t xml:space="preserve">de</w:t>
+      </w:r>
+      <w:r>
+        <w:t xml:space="preserve"> </w:t>
+      </w:r>
+      <w:r>
+        <w:rPr>
+          <w:i/>
+          <w:iCs/>
+        </w:rPr>
+        <w:t xml:space="preserve">backup.log</w:t>
+      </w:r>
+      <w:r>
+        <w:t xml:space="preserve">).</w:t>
       </w:r>
     </w:p>
     <w:bookmarkEnd w:id="41"/>
@@ -8312,7 +8611,36 @@
         <w:t xml:space="preserve">npm run publish:update</w:t>
       </w:r>
       <w:r>
-        <w:t xml:space="preserve">) no basta, porque solo cambia el código de las pantallas.</w:t>
+        <w:t xml:space="preserve">) no basta, porque solo cambia el código de las pantallas. Los cambios de la app del 21 de octubre de 2026 (comprobante comprimido, lupa del QR y pantalla de actualización obligatoria) no agregan módulos nativos y sí llegan con</w:t>
+      </w:r>
+      <w:r>
+        <w:t xml:space="preserve"> </w:t>
+      </w:r>
+      <w:r>
+        <w:rPr>
+          <w:i/>
+          <w:iCs/>
+        </w:rPr>
+        <w:t xml:space="preserve">npm run publish:update</w:t>
+      </w:r>
+      <w:r>
+        <w:t xml:space="preserve">; desde entonces, si el servidor publica un APK con</w:t>
+      </w:r>
+      <w:r>
+        <w:t xml:space="preserve"> </w:t>
+      </w:r>
+      <w:r>
+        <w:rPr>
+          <w:i/>
+          <w:iCs/>
+        </w:rPr>
+        <w:t xml:space="preserve">versionCode</w:t>
+      </w:r>
+      <w:r>
+        <w:t xml:space="preserve"> </w:t>
+      </w:r>
+      <w:r>
+        <w:t xml:space="preserve">mayor, la app pide instalarlo antes de seguir.</w:t>
       </w:r>
     </w:p>
     <w:p>
@@ -9504,6 +9832,96 @@
           </w:p>
         </w:tc>
       </w:tr>
+      <w:tr>
+        <w:tc>
+          <w:tcPr/>
+          <w:p>
+            <w:pPr>
+              <w:pStyle w:val="Compact"/>
+            </w:pPr>
+            <w:r>
+              <w:t xml:space="preserve">H10</w:t>
+            </w:r>
+          </w:p>
+        </w:tc>
+        <w:tc>
+          <w:tcPr/>
+          <w:p>
+            <w:pPr>
+              <w:pStyle w:val="Compact"/>
+            </w:pPr>
+            <w:r>
+              <w:t xml:space="preserve">Cerrar sesión y repetir una llamada con el mismo token (</w:t>
+            </w:r>
+            <w:r>
+              <w:rPr>
+                <w:i/>
+                <w:iCs/>
+              </w:rPr>
+              <w:t xml:space="preserve">curl -i -H "Authorization: Bearer &lt;token&gt;" https://&lt;dominio&gt;/api/v1/bookings/me</w:t>
+            </w:r>
+            <w:r>
+              <w:t xml:space="preserve">).</w:t>
+            </w:r>
+          </w:p>
+        </w:tc>
+        <w:tc>
+          <w:tcPr/>
+          <w:p>
+            <w:pPr>
+              <w:pStyle w:val="Compact"/>
+            </w:pPr>
+            <w:r>
+              <w:t xml:space="preserve">401: el gateway corta el token de la sesión cerrada (versión del 21 de octubre de 2026 o posterior).</w:t>
+            </w:r>
+          </w:p>
+        </w:tc>
+      </w:tr>
+      <w:tr>
+        <w:tc>
+          <w:tcPr/>
+          <w:p>
+            <w:pPr>
+              <w:pStyle w:val="Compact"/>
+            </w:pPr>
+            <w:r>
+              <w:t xml:space="preserve">H11</w:t>
+            </w:r>
+          </w:p>
+        </w:tc>
+        <w:tc>
+          <w:tcPr/>
+          <w:p>
+            <w:pPr>
+              <w:pStyle w:val="Compact"/>
+            </w:pPr>
+            <w:r>
+              <w:t xml:space="preserve">Con el token del administrador, consultar las reservas por cerrar (</w:t>
+            </w:r>
+            <w:r>
+              <w:rPr>
+                <w:i/>
+                <w:iCs/>
+              </w:rPr>
+              <w:t xml:space="preserve">GET /api/v1/admin/assignments/to-close</w:t>
+            </w:r>
+            <w:r>
+              <w:t xml:space="preserve">) y abrir el inicio del administrador.</w:t>
+            </w:r>
+          </w:p>
+        </w:tc>
+        <w:tc>
+          <w:tcPr/>
+          <w:p>
+            <w:pPr>
+              <w:pStyle w:val="Compact"/>
+            </w:pPr>
+            <w:r>
+              <w:t xml:space="preserve">200 con la lista (puede estar vacía); la tarjeta "Por cerrar" solo aparece si hay algo pendiente (versión de la noche del 21 de octubre de 2026 o posterior).</w:t>
+            </w:r>
+          </w:p>
+        </w:tc>
+      </w:tr>
     </w:tbl>
     <w:p>
       <w:pPr>
@@ -9538,7 +9956,7 @@
         <w:t xml:space="preserve"> </w:t>
       </w:r>
       <w:r>
-        <w:t xml:space="preserve">las nueve pruebas pasan. Una falla en H1 a H8 activa la evaluación de reversión (sección 12).</w:t>
+        <w:t xml:space="preserve">las once pruebas pasan. Una falla en H1 a H8, H10 o H11 activa la evaluación de reversión (sección 12).</w:t>
       </w:r>
     </w:p>
     <w:bookmarkEnd w:id="46"/>
@@ -10335,7 +10753,115 @@
               <w:pStyle w:val="Compact"/>
             </w:pPr>
             <w:r>
-              <w:t xml:space="preserve">Archivo del día y bitácora de respaldos.</w:t>
+              <w:t xml:space="preserve">Archivo del día y bitácora de respaldos; en el servidor público,</w:t>
+            </w:r>
+            <w:r>
+              <w:t xml:space="preserve"> </w:t>
+            </w:r>
+            <w:r>
+              <w:rPr>
+                <w:i/>
+                <w:iCs/>
+              </w:rPr>
+              <w:t xml:space="preserve">tail -5 ~/lavarapido/backups/backup.log</w:t>
+            </w:r>
+            <w:r>
+              <w:t xml:space="preserve"> </w:t>
+            </w:r>
+            <w:r>
+              <w:t xml:space="preserve">con</w:t>
+            </w:r>
+            <w:r>
+              <w:t xml:space="preserve"> </w:t>
+            </w:r>
+            <w:r>
+              <w:rPr>
+                <w:i/>
+                <w:iCs/>
+              </w:rPr>
+              <w:t xml:space="preserve">RESPALDO | OK</w:t>
+            </w:r>
+            <w:r>
+              <w:t xml:space="preserve"> </w:t>
+            </w:r>
+            <w:r>
+              <w:t xml:space="preserve">y</w:t>
+            </w:r>
+            <w:r>
+              <w:t xml:space="preserve"> </w:t>
+            </w:r>
+            <w:r>
+              <w:rPr>
+                <w:i/>
+                <w:iCs/>
+              </w:rPr>
+              <w:t xml:space="preserve">VERIFICACIÓN | OK</w:t>
+            </w:r>
+            <w:r>
+              <w:t xml:space="preserve"> </w:t>
+            </w:r>
+            <w:r>
+              <w:t xml:space="preserve">del día, y</w:t>
+            </w:r>
+            <w:r>
+              <w:t xml:space="preserve"> </w:t>
+            </w:r>
+            <w:r>
+              <w:rPr>
+                <w:i/>
+                <w:iCs/>
+              </w:rPr>
+              <w:t xml:space="preserve">grep FALLÓ</w:t>
+            </w:r>
+            <w:r>
+              <w:t xml:space="preserve"> </w:t>
+            </w:r>
+            <w:r>
+              <w:t xml:space="preserve">sin resultados.</w:t>
+            </w:r>
+          </w:p>
+        </w:tc>
+      </w:tr>
+      <w:tr>
+        <w:tc>
+          <w:tcPr/>
+          <w:p>
+            <w:pPr>
+              <w:pStyle w:val="Compact"/>
+            </w:pPr>
+            <w:r>
+              <w:t xml:space="preserve">Estado de los contenedores (servidor público)</w:t>
+            </w:r>
+          </w:p>
+        </w:tc>
+        <w:tc>
+          <w:tcPr/>
+          <w:p>
+            <w:pPr>
+              <w:pStyle w:val="Compact"/>
+            </w:pPr>
+            <w:r>
+              <w:rPr>
+                <w:i/>
+                <w:iCs/>
+              </w:rPr>
+              <w:t xml:space="preserve">docker compose ps</w:t>
+            </w:r>
+            <w:r>
+              <w:t xml:space="preserve">: todos</w:t>
+            </w:r>
+            <w:r>
+              <w:t xml:space="preserve"> </w:t>
+            </w:r>
+            <w:r>
+              <w:rPr>
+                <w:i/>
+                <w:iCs/>
+              </w:rPr>
+              <w:t xml:space="preserve">healthy</w:t>
+            </w:r>
+            <w:r>
+              <w:t xml:space="preserve">.</w:t>
             </w:r>
           </w:p>
         </w:tc>
@@ -10628,7 +11154,7 @@
               <w:pStyle w:val="Compact"/>
             </w:pPr>
             <w:r>
-              <w:t xml:space="preserve">Una prueba de humo H1 a H8 falla y no se corrige en 30 minutos</w:t>
+              <w:t xml:space="preserve">Una prueba de humo H1 a H8, H10 o H11 falla y no se corrige en 30 minutos</w:t>
             </w:r>
           </w:p>
         </w:tc>
@@ -10812,7 +11338,33 @@
         </w:numPr>
       </w:pPr>
       <w:r>
-        <w:t xml:space="preserve">Restaurar el respaldo previo de la fase 3 (Manual de Administrador, sección 15.2). Los changesets de Liquibase solo avanzan, por lo que</w:t>
+        <w:t xml:space="preserve">Restaurar el respaldo previo de la fase 3 (Manual de Administrador, sección 15.2). En el servidor público se usa</w:t>
+      </w:r>
+      <w:r>
+        <w:t xml:space="preserve"> </w:t>
+      </w:r>
+      <w:r>
+        <w:rPr>
+          <w:i/>
+          <w:iCs/>
+        </w:rPr>
+        <w:t xml:space="preserve">bash deploy/restore-db.sh &lt;respaldo.bak.gz&gt;</w:t>
+      </w:r>
+      <w:r>
+        <w:t xml:space="preserve">: pide escribir</w:t>
+      </w:r>
+      <w:r>
+        <w:t xml:space="preserve"> </w:t>
+      </w:r>
+      <w:r>
+        <w:rPr>
+          <w:i/>
+          <w:iCs/>
+        </w:rPr>
+        <w:t xml:space="preserve">RESTAURAR</w:t>
+      </w:r>
+      <w:r>
+        <w:t xml:space="preserve">, guarda antes un respaldo de cómo estaba la base, detiene los servicios, restaura y los vuelve a levantar. Los changesets de Liquibase solo avanzan, por lo que</w:t>
       </w:r>
       <w:r>
         <w:t xml:space="preserve"> </w:t>
@@ -11285,7 +11837,46 @@
         <w:t xml:space="preserve">docker-compose.yml</w:t>
       </w:r>
       <w:r>
-        <w:t xml:space="preserve">.</w:t>
+        <w:t xml:space="preserve">. Las del 21 de octubre de 2026 (</w:t>
+      </w:r>
+      <w:r>
+        <w:rPr>
+          <w:i/>
+          <w:iCs/>
+        </w:rPr>
+        <w:t xml:space="preserve">SESSION_CHECK_*</w:t>
+      </w:r>
+      <w:r>
+        <w:t xml:space="preserve">,</w:t>
+      </w:r>
+      <w:r>
+        <w:t xml:space="preserve"> </w:t>
+      </w:r>
+      <w:r>
+        <w:rPr>
+          <w:i/>
+          <w:iCs/>
+        </w:rPr>
+        <w:t xml:space="preserve">BOOKING_EXPIRY_*</w:t>
+      </w:r>
+      <w:r>
+        <w:t xml:space="preserve"> </w:t>
+      </w:r>
+      <w:r>
+        <w:t xml:space="preserve">y</w:t>
+      </w:r>
+      <w:r>
+        <w:t xml:space="preserve"> </w:t>
+      </w:r>
+      <w:r>
+        <w:rPr>
+          <w:i/>
+          <w:iCs/>
+        </w:rPr>
+        <w:t xml:space="preserve">FOLLOW_UP_*</w:t>
+      </w:r>
+      <w:r>
+        <w:t xml:space="preserve">) todavía no cumplen esta regla (acción ACO-14).</w:t>
       </w:r>
     </w:p>
     <w:p>
@@ -11930,7 +12521,7 @@
               <w:pStyle w:val="Compact"/>
             </w:pPr>
             <w:r>
-              <w:t xml:space="preserve">Respaldo previo (fase 3) y respaldo diario.</w:t>
+              <w:t xml:space="preserve">Respaldo previo (fase 3) y respaldo diario, ambos verificados; en el servidor público son automáticos (Documento de Despliegue, sección 3.2).</w:t>
             </w:r>
           </w:p>
         </w:tc>
@@ -12117,7 +12708,74 @@
               <w:pStyle w:val="Compact"/>
             </w:pPr>
             <w:r>
-              <w:t xml:space="preserve">Explicarlo en la capacitación; la autorización real la da el rol del token.</w:t>
+              <w:t xml:space="preserve">Explicarlo en la capacitación; la autorización real la da el rol del token, y desde el 21 de octubre de 2026 la pestaña de roles lo dice.</w:t>
+            </w:r>
+          </w:p>
+        </w:tc>
+      </w:tr>
+      <w:tr>
+        <w:tc>
+          <w:tcPr/>
+          <w:p>
+            <w:pPr>
+              <w:pStyle w:val="Compact"/>
+            </w:pPr>
+            <w:r>
+              <w:t xml:space="preserve">R-I11</w:t>
+            </w:r>
+          </w:p>
+        </w:tc>
+        <w:tc>
+          <w:tcPr/>
+          <w:p>
+            <w:pPr>
+              <w:pStyle w:val="Compact"/>
+            </w:pPr>
+            <w:r>
+              <w:t xml:space="preserve">Si security-service no responde, el gateway deja pasar las peticiones sin confirmar la sesión, y un token de una sesión cerrada sirve hasta que vence (máximo 1 hora); con security-service activo, hasta 30 segundos.</w:t>
+            </w:r>
+          </w:p>
+        </w:tc>
+        <w:tc>
+          <w:tcPr/>
+          <w:p>
+            <w:pPr>
+              <w:pStyle w:val="Compact"/>
+            </w:pPr>
+            <w:r>
+              <w:t xml:space="preserve">Baja</w:t>
+            </w:r>
+          </w:p>
+        </w:tc>
+        <w:tc>
+          <w:tcPr/>
+          <w:p>
+            <w:pPr>
+              <w:pStyle w:val="Compact"/>
+            </w:pPr>
+            <w:r>
+              <w:t xml:space="preserve">Medio</w:t>
+            </w:r>
+          </w:p>
+        </w:tc>
+        <w:tc>
+          <w:tcPr/>
+          <w:p>
+            <w:pPr>
+              <w:pStyle w:val="Compact"/>
+            </w:pPr>
+            <w:r>
+              <w:t xml:space="preserve">Revisar la salud de security-service (fase 5 y Tabla 10) y el registro del gateway (</w:t>
+            </w:r>
+            <w:r>
+              <w:rPr>
+                <w:i/>
+                <w:iCs/>
+              </w:rPr>
+              <w:t xml:space="preserve">No se pudo confirmar la sesión</w:t>
+            </w:r>
+            <w:r>
+              <w:t xml:space="preserve">).</w:t>
             </w:r>
           </w:p>
         </w:tc>
@@ -15557,9 +16215,30 @@
         <w:br/>
       </w:r>
       <w:r>
+        <w:rPr>
+          <w:rStyle w:val="FunctionTok"/>
+        </w:rPr>
+        <w:t xml:space="preserve">bash</w:t>
+      </w:r>
+      <w:r>
+        <w:rPr>
+          <w:rStyle w:val="NormalTok"/>
+        </w:rPr>
+        <w:t xml:space="preserve"> ~/lavarapido/lavarapido-infra/deploy/backup-db.sh   </w:t>
+      </w:r>
+      <w:r>
+        <w:rPr>
+          <w:rStyle w:val="CommentTok"/>
+        </w:rPr>
+        <w:t xml:space="preserve"># servidor público (update-server.sh lo hace solo)</w:t>
+      </w:r>
+      <w:r>
         <w:br/>
       </w:r>
       <w:r>
+        <w:br/>
+      </w:r>
+      <w:r>
         <w:rPr>
           <w:rStyle w:val="CommentTok"/>
         </w:rPr>
@@ -15834,6 +16513,51 @@
           <w:rStyle w:val="CommentTok"/>
         </w:rPr>
         <w:t xml:space="preserve"># Reversión (ver sección 12)</w:t>
+      </w:r>
+      <w:r>
+        <w:br/>
+      </w:r>
+      <w:r>
+        <w:rPr>
+          <w:rStyle w:val="FunctionTok"/>
+        </w:rPr>
+        <w:t xml:space="preserve">bash</w:t>
+      </w:r>
+      <w:r>
+        <w:rPr>
+          <w:rStyle w:val="NormalTok"/>
+        </w:rPr>
+        <w:t xml:space="preserve"> ~/lavarapido/lavarapido-infra/deploy/restore-db.sh </w:t>
+      </w:r>
+      <w:r>
+        <w:rPr>
+          <w:rStyle w:val="OperatorTok"/>
+        </w:rPr>
+        <w:t xml:space="preserve">&lt;</w:t>
+      </w:r>
+      <w:r>
+        <w:rPr>
+          <w:rStyle w:val="NormalTok"/>
+        </w:rPr>
+        <w:t xml:space="preserve">respaldo.bak.gz</w:t>
+      </w:r>
+      <w:r>
+        <w:rPr>
+          <w:rStyle w:val="OperatorTok"/>
+        </w:rPr>
+        <w:t xml:space="preserve">&gt;</w:t>
+      </w:r>
+      <w:r>
+        <w:rPr>
+          <w:rStyle w:val="NormalTok"/>
+        </w:rPr>
+        <w:t xml:space="preserve">   </w:t>
+      </w:r>
+      <w:r>
+        <w:rPr>
+          <w:rStyle w:val="CommentTok"/>
+        </w:rPr>
+        <w:t xml:space="preserve"># servidor público</w:t>
       </w:r>
       <w:r>
         <w:br/>

</xml_diff>